<commit_message>
use multi moedel for segmentatiuon
</commit_message>
<xml_diff>
--- a/GVFA/Documents/Results-Pooling.docx
+++ b/GVFA/Documents/Results-Pooling.docx
@@ -5,19 +5,37 @@
     <w:tbl>
       <w:tblPr>
         <w:tblStyle w:val="TableGrid"/>
-        <w:tblW w:w="11651" w:type="dxa"/>
-        <w:tblInd w:w="-1281" w:type="dxa"/>
+        <w:tblW w:w="11945" w:type="dxa"/>
+        <w:tblInd w:w="-1445" w:type="dxa"/>
+        <w:tblLayout w:type="fixed"/>
         <w:tblLook w:val="04A0" w:firstRow="1" w:lastRow="0" w:firstColumn="1" w:lastColumn="0" w:noHBand="0" w:noVBand="1"/>
       </w:tblPr>
       <w:tblGrid>
-        <w:gridCol w:w="10065"/>
-        <w:gridCol w:w="1302"/>
-        <w:gridCol w:w="284"/>
+        <w:gridCol w:w="283"/>
+        <w:gridCol w:w="10088"/>
+        <w:gridCol w:w="1294"/>
+        <w:gridCol w:w="280"/>
       </w:tblGrid>
       <w:tr>
         <w:tc>
           <w:tcPr>
-            <w:tcW w:w="10065" w:type="dxa"/>
+            <w:tcW w:w="283" w:type="dxa"/>
+          </w:tcPr>
+          <w:p>
+            <w:pPr>
+              <w:ind w:left="-532" w:firstLine="532"/>
+            </w:pPr>
+            <w:r>
+              <w:t>1</w:t>
+            </w:r>
+            <w:r>
+              <w:t>.</w:t>
+            </w:r>
+          </w:p>
+        </w:tc>
+        <w:tc>
+          <w:tcPr>
+            <w:tcW w:w="10088" w:type="dxa"/>
           </w:tcPr>
           <w:p>
             <w:pPr>
@@ -133,7 +151,7 @@
         </w:tc>
         <w:tc>
           <w:tcPr>
-            <w:tcW w:w="1302" w:type="dxa"/>
+            <w:tcW w:w="1294" w:type="dxa"/>
           </w:tcPr>
           <w:p>
             <w:pPr>
@@ -223,23 +241,7 @@
                 <w:sz w:val="10"/>
                 <w:szCs w:val="10"/>
               </w:rPr>
-              <w:t xml:space="preserve">W_EDGE_S_DX, W_EDGE_S_DY, W_EDGE_S_DT = 0.5, 0.5, </w:t>
-            </w:r>
-            <w:proofErr w:type="gramStart"/>
-            <w:r>
-              <w:rPr>
-                <w:sz w:val="10"/>
-                <w:szCs w:val="10"/>
-              </w:rPr>
-              <w:t>0.3  #</w:t>
-            </w:r>
-            <w:proofErr w:type="gramEnd"/>
-            <w:r>
-              <w:rPr>
-                <w:sz w:val="10"/>
-                <w:szCs w:val="10"/>
-              </w:rPr>
-              <w:t xml:space="preserve">                Short-range displacement</w:t>
+              <w:t>W_EDGE_S_DX, W_EDGE_S_DY, W_EDGE_S_DT = 0.5, 0.5, 0.3  #                Short-range displacement</w:t>
             </w:r>
           </w:p>
           <w:p>
@@ -277,23 +279,7 @@
                 <w:sz w:val="10"/>
                 <w:szCs w:val="10"/>
               </w:rPr>
-              <w:t xml:space="preserve">W_EDGE_T_DX, W_EDGE_T_DY, W_EDGE_T_DT = 0.5, 0.5, </w:t>
-            </w:r>
-            <w:proofErr w:type="gramStart"/>
-            <w:r>
-              <w:rPr>
-                <w:sz w:val="10"/>
-                <w:szCs w:val="10"/>
-              </w:rPr>
-              <w:t>0.3  #</w:t>
-            </w:r>
-            <w:proofErr w:type="gramEnd"/>
-            <w:r>
-              <w:rPr>
-                <w:sz w:val="10"/>
-                <w:szCs w:val="10"/>
-              </w:rPr>
-              <w:t xml:space="preserve"> 0.5, 0.5, 0.5        Displacement over longer </w:t>
+              <w:t xml:space="preserve">W_EDGE_T_DX, W_EDGE_T_DY, W_EDGE_T_DT = 0.5, 0.5, 0.3  # 0.5, 0.5, 0.5        Displacement over longer </w:t>
             </w:r>
             <w:proofErr w:type="spellStart"/>
             <w:r>
@@ -317,37 +303,21 @@
                 <w:sz w:val="10"/>
                 <w:szCs w:val="10"/>
               </w:rPr>
-              <w:t xml:space="preserve">W_EDGE_T_VX, W_EDGE_T_VY, W_EDGE_T_DP = 5.0, 5.0, </w:t>
+              <w:t>W_EDGE_T_VX, W_EDGE_T_VY, W_EDGE_T_DP = 5.0, 5.0, 0.5  # 2.5, 2.5, 1.0  </w:t>
             </w:r>
-            <w:proofErr w:type="gramStart"/>
-            <w:r>
-              <w:rPr>
-                <w:sz w:val="10"/>
-                <w:szCs w:val="10"/>
-              </w:rPr>
-              <w:t>0.5  #</w:t>
-            </w:r>
-            <w:proofErr w:type="gramEnd"/>
-            <w:r>
-              <w:rPr>
-                <w:sz w:val="10"/>
-                <w:szCs w:val="10"/>
-              </w:rPr>
-              <w:t xml:space="preserve"> 2.5, 2.5, 1.0  </w:t>
-            </w:r>
-          </w:p>
-          <w:p>
-            <w:pPr>
-              <w:rPr>
-                <w:sz w:val="10"/>
-                <w:szCs w:val="10"/>
-              </w:rPr>
-            </w:pPr>
-          </w:p>
-        </w:tc>
-        <w:tc>
-          <w:tcPr>
-            <w:tcW w:w="284" w:type="dxa"/>
+          </w:p>
+          <w:p>
+            <w:pPr>
+              <w:rPr>
+                <w:sz w:val="10"/>
+                <w:szCs w:val="10"/>
+              </w:rPr>
+            </w:pPr>
+          </w:p>
+        </w:tc>
+        <w:tc>
+          <w:tcPr>
+            <w:tcW w:w="280" w:type="dxa"/>
           </w:tcPr>
           <w:p>
             <w:pPr>
@@ -359,23 +329,163 @@
       <w:tr>
         <w:tc>
           <w:tcPr>
-            <w:tcW w:w="10065" w:type="dxa"/>
+            <w:tcW w:w="283" w:type="dxa"/>
           </w:tcPr>
           <w:p>
             <w:pPr>
               <w:ind w:left="-532" w:firstLine="532"/>
             </w:pPr>
-          </w:p>
-        </w:tc>
-        <w:tc>
-          <w:tcPr>
-            <w:tcW w:w="1302" w:type="dxa"/>
-          </w:tcPr>
-          <w:p/>
-        </w:tc>
-        <w:tc>
-          <w:tcPr>
-            <w:tcW w:w="284" w:type="dxa"/>
+            <w:r>
+              <w:t>2</w:t>
+            </w:r>
+          </w:p>
+        </w:tc>
+        <w:tc>
+          <w:tcPr>
+            <w:tcW w:w="10088" w:type="dxa"/>
+          </w:tcPr>
+          <w:p>
+            <w:pPr>
+              <w:ind w:left="-532" w:firstLine="532"/>
+            </w:pPr>
+            <w:r>
+              <w:rPr>
+                <w:noProof/>
+              </w:rPr>
+              <w:drawing>
+                <wp:inline distT="0" distB="0" distL="0" distR="0" wp14:anchorId="5C87B606" wp14:editId="7065B116">
+                  <wp:extent cx="2961564" cy="2308548"/>
+                  <wp:effectExtent l="0" t="0" r="0" b="0"/>
+                  <wp:docPr id="1874653925" name="Picture 1"/>
+                  <wp:cNvGraphicFramePr>
+                    <a:graphicFrameLocks xmlns:a="http://schemas.openxmlformats.org/drawingml/2006/main" noChangeAspect="1"/>
+                  </wp:cNvGraphicFramePr>
+                  <a:graphic xmlns:a="http://schemas.openxmlformats.org/drawingml/2006/main">
+                    <a:graphicData uri="http://schemas.openxmlformats.org/drawingml/2006/picture">
+                      <pic:pic xmlns:pic="http://schemas.openxmlformats.org/drawingml/2006/picture">
+                        <pic:nvPicPr>
+                          <pic:cNvPr id="0" name="Picture 1"/>
+                          <pic:cNvPicPr>
+                            <a:picLocks noChangeAspect="1" noChangeArrowheads="1"/>
+                          </pic:cNvPicPr>
+                        </pic:nvPicPr>
+                        <pic:blipFill>
+                          <a:blip r:embed="rId6" cstate="print">
+                            <a:extLst>
+                              <a:ext uri="{28A0092B-C50C-407E-A947-70E740481C1C}">
+                                <a14:useLocalDpi xmlns:a14="http://schemas.microsoft.com/office/drawing/2010/main" val="0"/>
+                              </a:ext>
+                            </a:extLst>
+                          </a:blip>
+                          <a:srcRect/>
+                          <a:stretch>
+                            <a:fillRect/>
+                          </a:stretch>
+                        </pic:blipFill>
+                        <pic:spPr bwMode="auto">
+                          <a:xfrm>
+                            <a:off x="0" y="0"/>
+                            <a:ext cx="2979700" cy="2322685"/>
+                          </a:xfrm>
+                          <a:prstGeom prst="rect">
+                            <a:avLst/>
+                          </a:prstGeom>
+                          <a:noFill/>
+                          <a:ln>
+                            <a:noFill/>
+                          </a:ln>
+                        </pic:spPr>
+                      </pic:pic>
+                    </a:graphicData>
+                  </a:graphic>
+                </wp:inline>
+              </w:drawing>
+            </w:r>
+            <w:r>
+              <w:rPr>
+                <w:noProof/>
+              </w:rPr>
+              <w:drawing>
+                <wp:inline distT="0" distB="0" distL="0" distR="0" wp14:anchorId="51A68C59" wp14:editId="77F440C5">
+                  <wp:extent cx="3090526" cy="2395183"/>
+                  <wp:effectExtent l="0" t="0" r="0" b="5715"/>
+                  <wp:docPr id="172930551" name="Picture 2"/>
+                  <wp:cNvGraphicFramePr>
+                    <a:graphicFrameLocks xmlns:a="http://schemas.openxmlformats.org/drawingml/2006/main" noChangeAspect="1"/>
+                  </wp:cNvGraphicFramePr>
+                  <a:graphic xmlns:a="http://schemas.openxmlformats.org/drawingml/2006/main">
+                    <a:graphicData uri="http://schemas.openxmlformats.org/drawingml/2006/picture">
+                      <pic:pic xmlns:pic="http://schemas.openxmlformats.org/drawingml/2006/picture">
+                        <pic:nvPicPr>
+                          <pic:cNvPr id="0" name="Picture 2"/>
+                          <pic:cNvPicPr>
+                            <a:picLocks noChangeAspect="1" noChangeArrowheads="1"/>
+                          </pic:cNvPicPr>
+                        </pic:nvPicPr>
+                        <pic:blipFill>
+                          <a:blip r:embed="rId7" cstate="print">
+                            <a:extLst>
+                              <a:ext uri="{28A0092B-C50C-407E-A947-70E740481C1C}">
+                                <a14:useLocalDpi xmlns:a14="http://schemas.microsoft.com/office/drawing/2010/main" val="0"/>
+                              </a:ext>
+                            </a:extLst>
+                          </a:blip>
+                          <a:srcRect/>
+                          <a:stretch>
+                            <a:fillRect/>
+                          </a:stretch>
+                        </pic:blipFill>
+                        <pic:spPr bwMode="auto">
+                          <a:xfrm>
+                            <a:off x="0" y="0"/>
+                            <a:ext cx="3096194" cy="2399576"/>
+                          </a:xfrm>
+                          <a:prstGeom prst="rect">
+                            <a:avLst/>
+                          </a:prstGeom>
+                          <a:noFill/>
+                          <a:ln>
+                            <a:noFill/>
+                          </a:ln>
+                        </pic:spPr>
+                      </pic:pic>
+                    </a:graphicData>
+                  </a:graphic>
+                </wp:inline>
+              </w:drawing>
+            </w:r>
+          </w:p>
+        </w:tc>
+        <w:tc>
+          <w:tcPr>
+            <w:tcW w:w="1294" w:type="dxa"/>
+          </w:tcPr>
+          <w:p>
+            <w:r>
+              <w:rPr>
+                <w:sz w:val="16"/>
+                <w:szCs w:val="16"/>
+              </w:rPr>
+              <w:t>Fable result</w:t>
+            </w:r>
+            <w:r>
+              <w:rPr>
+                <w:sz w:val="16"/>
+                <w:szCs w:val="16"/>
+              </w:rPr>
+              <w:br/>
+            </w:r>
+            <w:r>
+              <w:t xml:space="preserve">Commit - </w:t>
+            </w:r>
+            <w:r>
+              <w:t>add fable based method</w:t>
+            </w:r>
+          </w:p>
+        </w:tc>
+        <w:tc>
+          <w:tcPr>
+            <w:tcW w:w="280" w:type="dxa"/>
           </w:tcPr>
           <w:p/>
         </w:tc>
@@ -383,7 +493,7 @@
       <w:tr>
         <w:tc>
           <w:tcPr>
-            <w:tcW w:w="10065" w:type="dxa"/>
+            <w:tcW w:w="283" w:type="dxa"/>
           </w:tcPr>
           <w:p>
             <w:pPr>
@@ -393,13 +503,23 @@
         </w:tc>
         <w:tc>
           <w:tcPr>
-            <w:tcW w:w="1302" w:type="dxa"/>
+            <w:tcW w:w="10088" w:type="dxa"/>
+          </w:tcPr>
+          <w:p>
+            <w:pPr>
+              <w:ind w:left="-532" w:firstLine="532"/>
+            </w:pPr>
+          </w:p>
+        </w:tc>
+        <w:tc>
+          <w:tcPr>
+            <w:tcW w:w="1294" w:type="dxa"/>
           </w:tcPr>
           <w:p/>
         </w:tc>
         <w:tc>
           <w:tcPr>
-            <w:tcW w:w="284" w:type="dxa"/>
+            <w:tcW w:w="280" w:type="dxa"/>
           </w:tcPr>
           <w:p/>
         </w:tc>
@@ -407,7 +527,7 @@
       <w:tr>
         <w:tc>
           <w:tcPr>
-            <w:tcW w:w="10065" w:type="dxa"/>
+            <w:tcW w:w="283" w:type="dxa"/>
           </w:tcPr>
           <w:p>
             <w:pPr>
@@ -417,13 +537,23 @@
         </w:tc>
         <w:tc>
           <w:tcPr>
-            <w:tcW w:w="1302" w:type="dxa"/>
+            <w:tcW w:w="10088" w:type="dxa"/>
+          </w:tcPr>
+          <w:p>
+            <w:pPr>
+              <w:ind w:left="-532" w:firstLine="532"/>
+            </w:pPr>
+          </w:p>
+        </w:tc>
+        <w:tc>
+          <w:tcPr>
+            <w:tcW w:w="1294" w:type="dxa"/>
           </w:tcPr>
           <w:p/>
         </w:tc>
         <w:tc>
           <w:tcPr>
-            <w:tcW w:w="284" w:type="dxa"/>
+            <w:tcW w:w="280" w:type="dxa"/>
           </w:tcPr>
           <w:p/>
         </w:tc>
@@ -431,7 +561,7 @@
       <w:tr>
         <w:tc>
           <w:tcPr>
-            <w:tcW w:w="10065" w:type="dxa"/>
+            <w:tcW w:w="283" w:type="dxa"/>
           </w:tcPr>
           <w:p>
             <w:pPr>
@@ -441,13 +571,23 @@
         </w:tc>
         <w:tc>
           <w:tcPr>
-            <w:tcW w:w="1302" w:type="dxa"/>
+            <w:tcW w:w="10088" w:type="dxa"/>
+          </w:tcPr>
+          <w:p>
+            <w:pPr>
+              <w:ind w:left="-532" w:firstLine="532"/>
+            </w:pPr>
+          </w:p>
+        </w:tc>
+        <w:tc>
+          <w:tcPr>
+            <w:tcW w:w="1294" w:type="dxa"/>
           </w:tcPr>
           <w:p/>
         </w:tc>
         <w:tc>
           <w:tcPr>
-            <w:tcW w:w="284" w:type="dxa"/>
+            <w:tcW w:w="280" w:type="dxa"/>
           </w:tcPr>
           <w:p/>
         </w:tc>
@@ -455,7 +595,7 @@
       <w:tr>
         <w:tc>
           <w:tcPr>
-            <w:tcW w:w="10065" w:type="dxa"/>
+            <w:tcW w:w="283" w:type="dxa"/>
           </w:tcPr>
           <w:p>
             <w:pPr>
@@ -465,13 +605,23 @@
         </w:tc>
         <w:tc>
           <w:tcPr>
-            <w:tcW w:w="1302" w:type="dxa"/>
+            <w:tcW w:w="10088" w:type="dxa"/>
+          </w:tcPr>
+          <w:p>
+            <w:pPr>
+              <w:ind w:left="-532" w:firstLine="532"/>
+            </w:pPr>
+          </w:p>
+        </w:tc>
+        <w:tc>
+          <w:tcPr>
+            <w:tcW w:w="1294" w:type="dxa"/>
           </w:tcPr>
           <w:p/>
         </w:tc>
         <w:tc>
           <w:tcPr>
-            <w:tcW w:w="284" w:type="dxa"/>
+            <w:tcW w:w="280" w:type="dxa"/>
           </w:tcPr>
           <w:p/>
         </w:tc>
@@ -479,7 +629,7 @@
       <w:tr>
         <w:tc>
           <w:tcPr>
-            <w:tcW w:w="10065" w:type="dxa"/>
+            <w:tcW w:w="283" w:type="dxa"/>
           </w:tcPr>
           <w:p>
             <w:pPr>
@@ -489,13 +639,23 @@
         </w:tc>
         <w:tc>
           <w:tcPr>
-            <w:tcW w:w="1302" w:type="dxa"/>
+            <w:tcW w:w="10088" w:type="dxa"/>
+          </w:tcPr>
+          <w:p>
+            <w:pPr>
+              <w:ind w:left="-532" w:firstLine="532"/>
+            </w:pPr>
+          </w:p>
+        </w:tc>
+        <w:tc>
+          <w:tcPr>
+            <w:tcW w:w="1294" w:type="dxa"/>
           </w:tcPr>
           <w:p/>
         </w:tc>
         <w:tc>
           <w:tcPr>
-            <w:tcW w:w="284" w:type="dxa"/>
+            <w:tcW w:w="280" w:type="dxa"/>
           </w:tcPr>
           <w:p/>
         </w:tc>
@@ -503,7 +663,7 @@
       <w:tr>
         <w:tc>
           <w:tcPr>
-            <w:tcW w:w="10065" w:type="dxa"/>
+            <w:tcW w:w="283" w:type="dxa"/>
           </w:tcPr>
           <w:p>
             <w:pPr>
@@ -513,13 +673,23 @@
         </w:tc>
         <w:tc>
           <w:tcPr>
-            <w:tcW w:w="1302" w:type="dxa"/>
+            <w:tcW w:w="10088" w:type="dxa"/>
+          </w:tcPr>
+          <w:p>
+            <w:pPr>
+              <w:ind w:left="-532" w:firstLine="532"/>
+            </w:pPr>
+          </w:p>
+        </w:tc>
+        <w:tc>
+          <w:tcPr>
+            <w:tcW w:w="1294" w:type="dxa"/>
           </w:tcPr>
           <w:p/>
         </w:tc>
         <w:tc>
           <w:tcPr>
-            <w:tcW w:w="284" w:type="dxa"/>
+            <w:tcW w:w="280" w:type="dxa"/>
           </w:tcPr>
           <w:p/>
         </w:tc>
@@ -1139,6 +1309,7 @@
   <w:style w:type="character" w:default="1" w:styleId="DefaultParagraphFont">
     <w:name w:val="Default Paragraph Font"/>
     <w:uiPriority w:val="1"/>
+    <w:semiHidden/>
     <w:unhideWhenUsed/>
   </w:style>
   <w:style w:type="table" w:default="1" w:styleId="TableNormal">

</xml_diff>